<commit_message>
feat(angebot-ah): drop Servicepauschale row, adjust signature spacing
- Remove the Servicepauschale (Reinigungsutensilien für HnD) notice +
  row from the services table; the table now flows Anfahrtspauschale →
  {#AhServices} → Gesamtbetrag. Drops the {#AhHasServicepauschale}
  conditional and the * footnote — no longer offered.
- Add two line breaks after "…Die Unterschrift gilt für uns als
  Auftragsbestätigung." and after "Angebot akzeptiert / Auftrag
  bestätigt:" for more breathing room above the signature line.
- Add one line break between "Mit freundlichen Grüßen," and
  "Ihr Team von der EmC2".

Co-Authored-By: Claude Opus 4.8 (1M context) <noreply@anthropic.com>
</commit_message>
<xml_diff>
--- a/src/templates/Angebot-AH-alt.docx
+++ b/src/templates/Angebot-AH-alt.docx
@@ -1289,259 +1289,6 @@
         <w:trPr/>
         <w:tc>
           <w:tcPr>
-            <w:tcW w:w="9354" w:type="dxa"/>
-            <w:tcBorders>
-              <w:top w:val="single" w:sz="6" w:space="0" w:color="333333"/>
-              <w:bottom w:val="single" w:sz="6" w:space="0" w:color="333333"/>
-              <w:left w:val="single" w:sz="6" w:space="0" w:color="333333"/>
-              <w:right w:val="single" w:sz="6" w:space="0" w:color="333333"/>
-            </w:tcBorders>
-            <w:shd w:val="clear" w:color="auto" w:fill="F5F5F5"/>
-            <w:tcMar>
-              <w:top w:w="60" w:type="dxa"/>
-              <w:left w:w="60" w:type="dxa"/>
-              <w:bottom w:w="60" w:type="dxa"/>
-              <w:right w:w="60" w:type="dxa"/>
-            </w:tcMar>
-          </w:tcPr>
-          <w:p>
-            <w:pPr>
-              <w:spacing w:before="40" w:after="40"/>
-              <w:rPr>
-                <w:rFonts w:ascii="Open Sans" w:eastAsia="Open Sans" w:hAnsi="Open Sans" w:cs="Open Sans"/>
-                <w:color w:val="070707"/>
-                <w:sz w:val="17"/>
-                <w:szCs w:val="17"/>
-              </w:rPr>
-            </w:pPr>
-            <w:r>
-              <w:rPr>
-                <w:rFonts w:ascii="Open Sans" w:eastAsia="Open Sans" w:hAnsi="Open Sans" w:cs="Open Sans"/>
-                <w:color w:val="070707"/>
-                <w:b/>
-                <w:bCs/>
-                <w:sz w:val="16"/>
-                <w:szCs w:val="16"/>
-              </w:rPr>
-              <w:t>{#AhHasServicepauschale}Folgende Pauschale wird nicht von der Krankenkasse übernommen und versteht sich inkl. MwSt. Diese rechnen wir, wenn benötigt / wie mit Ihnen vereinbart direkt mit Ihnen ab:</w:t>
-            </w:r>
-          </w:p>
-        </w:tc>
-      </w:tr>
-      <w:tr>
-        <w:trPr/>
-        <w:tc>
-          <w:tcPr>
-            <w:tcW w:w="466" w:type="dxa"/>
-            <w:tcBorders>
-              <w:top w:val="single" w:sz="6" w:space="0" w:color="333333"/>
-              <w:bottom w:val="single" w:sz="6" w:space="0" w:color="333333"/>
-              <w:left w:val="single" w:sz="6" w:space="0" w:color="333333"/>
-              <w:right w:val="single" w:sz="6" w:space="0" w:color="333333"/>
-            </w:tcBorders>
-            <w:tcMar>
-              <w:top w:w="60" w:type="dxa"/>
-              <w:left w:w="60" w:type="dxa"/>
-              <w:bottom w:w="60" w:type="dxa"/>
-              <w:right w:w="60" w:type="dxa"/>
-            </w:tcMar>
-          </w:tcPr>
-          <w:p>
-            <w:pPr>
-              <w:spacing w:before="0" w:after="40"/>
-              <w:rPr>
-                <w:rFonts w:ascii="Open Sans" w:eastAsia="Open Sans" w:hAnsi="Open Sans" w:cs="Open Sans"/>
-                <w:color w:val="070707"/>
-                <w:sz w:val="17"/>
-                <w:szCs w:val="17"/>
-              </w:rPr>
-            </w:pPr>
-            <w:r>
-              <w:rPr>
-                <w:rFonts w:ascii="Open Sans" w:eastAsia="Open Sans" w:hAnsi="Open Sans" w:cs="Open Sans"/>
-                <w:color w:val="070707"/>
-                <w:sz w:val="17"/>
-                <w:szCs w:val="17"/>
-              </w:rPr>
-              <w:t>*</w:t>
-            </w:r>
-          </w:p>
-        </w:tc>
-        <w:tc>
-          <w:tcPr>
-            <w:tcW w:w="5033" w:type="dxa"/>
-            <w:tcBorders>
-              <w:top w:val="single" w:sz="6" w:space="0" w:color="333333"/>
-              <w:bottom w:val="single" w:sz="6" w:space="0" w:color="333333"/>
-              <w:left w:val="single" w:sz="6" w:space="0" w:color="333333"/>
-              <w:right w:val="single" w:sz="6" w:space="0" w:color="333333"/>
-            </w:tcBorders>
-            <w:tcMar>
-              <w:top w:w="60" w:type="dxa"/>
-              <w:left w:w="60" w:type="dxa"/>
-              <w:bottom w:w="60" w:type="dxa"/>
-              <w:right w:w="60" w:type="dxa"/>
-            </w:tcMar>
-          </w:tcPr>
-          <w:p>
-            <w:pPr>
-              <w:spacing w:before="0" w:after="20"/>
-              <w:rPr>
-                <w:rFonts w:ascii="Open Sans" w:eastAsia="Open Sans" w:hAnsi="Open Sans" w:cs="Open Sans"/>
-                <w:color w:val="070707"/>
-                <w:sz w:val="17"/>
-                <w:szCs w:val="17"/>
-              </w:rPr>
-            </w:pPr>
-            <w:r>
-              <w:rPr>
-                <w:rFonts w:ascii="Open Sans" w:eastAsia="Open Sans" w:hAnsi="Open Sans" w:cs="Open Sans"/>
-                <w:color w:val="070707"/>
-                <w:b/>
-                <w:bCs/>
-                <w:sz w:val="17"/>
-                <w:szCs w:val="17"/>
-              </w:rPr>
-              <w:t>Servicepauschale Reinigungsutensilien für HnD</w:t>
-            </w:r>
-          </w:p>
-          <w:p>
-            <w:pPr>
-              <w:spacing w:before="0" w:after="40"/>
-              <w:rPr>
-                <w:rFonts w:ascii="Open Sans" w:eastAsia="Open Sans" w:hAnsi="Open Sans" w:cs="Open Sans"/>
-                <w:color w:val="070707"/>
-                <w:sz w:val="17"/>
-                <w:szCs w:val="17"/>
-              </w:rPr>
-            </w:pPr>
-            <w:r>
-              <w:rPr>
-                <w:rFonts w:ascii="Open Sans" w:eastAsia="Open Sans" w:hAnsi="Open Sans" w:cs="Open Sans"/>
-                <w:color w:val="444444"/>
-                <w:sz w:val="16"/>
-                <w:szCs w:val="16"/>
-              </w:rPr>
-              <w:t>1,20 € / Monat für Bereitstellung der Reinigungsutensilien – jährliche Abrechnung nach tatsächlichen Monaten, in denen Sie unsere Haushaltsnahen Dienstleistungen (HnD) in Anspruch genommen haben.</w:t>
-            </w:r>
-          </w:p>
-        </w:tc>
-        <w:tc>
-          <w:tcPr>
-            <w:tcW w:w="979" w:type="dxa"/>
-            <w:tcBorders>
-              <w:top w:val="single" w:sz="6" w:space="0" w:color="333333"/>
-              <w:bottom w:val="single" w:sz="6" w:space="0" w:color="333333"/>
-              <w:left w:val="single" w:sz="6" w:space="0" w:color="333333"/>
-              <w:right w:val="single" w:sz="6" w:space="0" w:color="333333"/>
-            </w:tcBorders>
-            <w:tcMar>
-              <w:top w:w="60" w:type="dxa"/>
-              <w:left w:w="60" w:type="dxa"/>
-              <w:bottom w:w="60" w:type="dxa"/>
-              <w:right w:w="60" w:type="dxa"/>
-            </w:tcMar>
-          </w:tcPr>
-          <w:p>
-            <w:pPr>
-              <w:spacing w:before="0" w:after="40"/>
-              <w:rPr>
-                <w:rFonts w:ascii="Open Sans" w:eastAsia="Open Sans" w:hAnsi="Open Sans" w:cs="Open Sans"/>
-                <w:color w:val="070707"/>
-                <w:sz w:val="17"/>
-                <w:szCs w:val="17"/>
-              </w:rPr>
-            </w:pPr>
-            <w:r>
-              <w:rPr>
-                <w:rFonts w:ascii="Open Sans" w:eastAsia="Open Sans" w:hAnsi="Open Sans" w:cs="Open Sans"/>
-                <w:color w:val="070707"/>
-                <w:sz w:val="17"/>
-                <w:szCs w:val="17"/>
-              </w:rPr>
-              <w:t>Pro Monat</w:t>
-            </w:r>
-          </w:p>
-        </w:tc>
-        <w:tc>
-          <w:tcPr>
-            <w:tcW w:w="1571" w:type="dxa"/>
-            <w:tcBorders>
-              <w:top w:val="single" w:sz="6" w:space="0" w:color="333333"/>
-              <w:bottom w:val="single" w:sz="6" w:space="0" w:color="333333"/>
-              <w:left w:val="single" w:sz="6" w:space="0" w:color="333333"/>
-              <w:right w:val="single" w:sz="6" w:space="0" w:color="333333"/>
-            </w:tcBorders>
-            <w:tcMar>
-              <w:top w:w="60" w:type="dxa"/>
-              <w:left w:w="60" w:type="dxa"/>
-              <w:bottom w:w="60" w:type="dxa"/>
-              <w:right w:w="60" w:type="dxa"/>
-            </w:tcMar>
-          </w:tcPr>
-          <w:p>
-            <w:pPr>
-              <w:spacing w:before="0" w:after="40"/>
-              <w:rPr>
-                <w:rFonts w:ascii="Open Sans" w:eastAsia="Open Sans" w:hAnsi="Open Sans" w:cs="Open Sans"/>
-                <w:color w:val="070707"/>
-                <w:sz w:val="17"/>
-                <w:szCs w:val="17"/>
-              </w:rPr>
-            </w:pPr>
-            <w:r>
-              <w:rPr>
-                <w:rFonts w:ascii="Open Sans" w:eastAsia="Open Sans" w:hAnsi="Open Sans" w:cs="Open Sans"/>
-                <w:color w:val="070707"/>
-                <w:sz w:val="17"/>
-                <w:szCs w:val="17"/>
-              </w:rPr>
-              <w:t>{AhServicepausEinzelpreis}</w:t>
-            </w:r>
-          </w:p>
-        </w:tc>
-        <w:tc>
-          <w:tcPr>
-            <w:tcW w:w="1305" w:type="dxa"/>
-            <w:tcBorders>
-              <w:top w:val="single" w:sz="6" w:space="0" w:color="333333"/>
-              <w:bottom w:val="single" w:sz="6" w:space="0" w:color="333333"/>
-              <w:left w:val="single" w:sz="6" w:space="0" w:color="333333"/>
-              <w:right w:val="single" w:sz="6" w:space="0" w:color="333333"/>
-            </w:tcBorders>
-            <w:tcMar>
-              <w:top w:w="60" w:type="dxa"/>
-              <w:left w:w="60" w:type="dxa"/>
-              <w:bottom w:w="60" w:type="dxa"/>
-              <w:right w:w="60" w:type="dxa"/>
-            </w:tcMar>
-          </w:tcPr>
-          <w:p>
-            <w:pPr>
-              <w:spacing w:before="0" w:after="40"/>
-              <w:rPr>
-                <w:rFonts w:ascii="Open Sans" w:eastAsia="Open Sans" w:hAnsi="Open Sans" w:cs="Open Sans"/>
-                <w:color w:val="070707"/>
-                <w:sz w:val="17"/>
-                <w:szCs w:val="17"/>
-              </w:rPr>
-            </w:pPr>
-            <w:r>
-              <w:rPr>
-                <w:rFonts w:ascii="Open Sans" w:eastAsia="Open Sans" w:hAnsi="Open Sans" w:cs="Open Sans"/>
-                <w:color w:val="070707"/>
-                <w:sz w:val="17"/>
-                <w:szCs w:val="17"/>
-              </w:rPr>
-              <w:t>{/AhHasServicepauschale}</w:t>
-            </w:r>
-          </w:p>
-        </w:tc>
-      </w:tr>
-      <w:tr>
-        <w:trPr/>
-        <w:tc>
-          <w:tcPr>
             <w:tcW w:w="8049" w:type="dxa"/>
             <w:tcBorders>
               <w:top w:val="single" w:sz="6" w:space="0" w:color="333333"/>
@@ -1810,6 +1557,16 @@
         </w:rPr>
         <w:t>Bitte unterschreiben Sie bei Annahme dieses Angebots und schicken Sie es uns zurück – gerne auch per E-Mail an service@e-m-c-2.de. Die Unterschrift gilt für uns als Auftragsbestätigung.</w:t>
       </w:r>
+      <w:r>
+        <w:rPr>
+          <w:rFonts w:ascii="Open Sans" w:eastAsia="Open Sans" w:hAnsi="Open Sans" w:cs="Open Sans"/>
+          <w:color w:val="070707"/>
+          <w:sz w:val="17"/>
+          <w:szCs w:val="17"/>
+        </w:rPr>
+        <w:br/>
+        <w:br/>
+      </w:r>
     </w:p>
     <w:p>
       <w:pPr>
@@ -1829,6 +1586,16 @@
           <w:szCs w:val="17"/>
         </w:rPr>
         <w:t>Angebot akzeptiert / Auftrag bestätigt:</w:t>
+      </w:r>
+      <w:r>
+        <w:rPr>
+          <w:rFonts w:ascii="Open Sans" w:eastAsia="Open Sans" w:hAnsi="Open Sans" w:cs="Open Sans"/>
+          <w:color w:val="070707"/>
+          <w:sz w:val="17"/>
+          <w:szCs w:val="17"/>
+        </w:rPr>
+        <w:br/>
+        <w:br/>
       </w:r>
     </w:p>
     <w:tbl>
@@ -1982,6 +1749,15 @@
           <w:szCs w:val="17"/>
         </w:rPr>
         <w:t>Mit freundlichen Grüßen,</w:t>
+      </w:r>
+      <w:r>
+        <w:rPr>
+          <w:rFonts w:ascii="Open Sans" w:eastAsia="Open Sans" w:hAnsi="Open Sans" w:cs="Open Sans"/>
+          <w:color w:val="070707"/>
+          <w:sz w:val="17"/>
+          <w:szCs w:val="17"/>
+        </w:rPr>
+        <w:br/>
       </w:r>
     </w:p>
     <w:p>

</xml_diff>

<commit_message>
chore(templates): update AH offer template documents
Co-Authored-By: Claude Opus 4.8 (1M context) <noreply@anthropic.com>
</commit_message>
<xml_diff>
--- a/src/templates/Angebot-AH-alt.docx
+++ b/src/templates/Angebot-AH-alt.docx
@@ -1730,6 +1730,15 @@
         </w:rPr>
         <w:t>Wir bedanken uns für Ihr Vertrauen und freuen uns von Ihnen zu hören!</w:t>
       </w:r>
+      <w:r>
+        <w:rPr>
+          <w:rFonts w:ascii="Open Sans" w:eastAsia="Open Sans" w:hAnsi="Open Sans" w:cs="Open Sans"/>
+          <w:color w:val="070707"/>
+          <w:sz w:val="17"/>
+          <w:szCs w:val="17"/>
+        </w:rPr>
+        <w:br/>
+      </w:r>
     </w:p>
     <w:p>
       <w:pPr>
@@ -1757,6 +1766,7 @@
           <w:sz w:val="17"/>
           <w:szCs w:val="17"/>
         </w:rPr>
+        <w:br/>
         <w:br/>
       </w:r>
     </w:p>

</xml_diff>